<commit_message>
Header bell and globe, clock in and out for Time & Attendance
- Clock in / clock out on Time & Attendance: each tap is a farm-level record
  in the outbox (works offline); everyone's recent entries listed above the
  F-02 weekly sheets. GET /api/sync/notes?kind=clock lists them (the notes
  endpoint now serves both kinds).
- Bell in the header: tasks waiting for a decision for owners and task
  managers, overdue tasks for a caretaker; tapping opens Review or Tasks.
- Globe in the header: switches the menu between English and Shona (labels
  to be checked by a Shona speaker); remembered per phone.

Tests: 88.

Co-Authored-By: Claude Opus 5.5 <noreply@anthropic.com>
Claude-Session: https://claude.ai/code/session_01J6H4iBJTAtuLFm8LTv1m8H
</commit_message>
<xml_diff>
--- a/docs/woodlands-farm-ops-spec-v1.1.docx
+++ b/docs/woodlands-farm-ops-spec-v1.1.docx
@@ -21006,7 +21006,7 @@
         <w:rPr>
           <w:rStyle w:val="VerbatimChar"/>
         </w:rPr>
-        <w:t xml:space="preserve">GET  /api/sync/notes  -&gt; { notes: [{ event_uuid, note, device_time, server_time, by, media: [{ media_uuid, kind, status }] }] }</w:t>
+        <w:t xml:space="preserve">GET  /api/sync/notes[?kind=clock]  -&gt; { notes: [{ event_uuid, note, device_time, server_time, by, media: [{ media_uuid, kind, status }] }] }</w:t>
       </w:r>
       <w:r>
         <w:br/>
@@ -21015,7 +21015,16 @@
         <w:rPr>
           <w:rStyle w:val="VerbatimChar"/>
         </w:rPr>
-        <w:t xml:space="preserve">                         (farm notes: field_recorded events with instance_id null and payload { note, media: [uuid] };</w:t>
+        <w:t xml:space="preserve">                         (farm notes, or clock-ins and outs with kind=clock: field_recorded events with instance_id null and payload</w:t>
+      </w:r>
+      <w:r>
+        <w:br/>
+      </w:r>
+      <w:r>
+        <w:rPr>
+          <w:rStyle w:val="VerbatimChar"/>
+        </w:rPr>
+        <w:t xml:space="preserve">                          { note, media: [uuid] } or { clock: in|out };</w:t>
       </w:r>
       <w:r>
         <w:br/>
@@ -25306,7 +25315,7 @@
               <w:jc w:val="left"/>
             </w:pPr>
             <w:r>
-              <w:t xml:space="preserve">Side menu; Notes (offline, with photos, video, voice), crop plan from the cached bundle, Time &amp; Attendance from F-02 records, Field Walk as the day’s walking and scouting tasks</w:t>
+              <w:t xml:space="preserve">Side menu; Notes (offline, with photos, video, voice), crop plan from the cached bundle, Time &amp; Attendance with offline clock in and out plus the F-02 sheets, a header bell (decisions waiting, or overdue tasks for a caretaker) and globe (English or Shona menu; Shona to be checked by a speaker), Field Walk as the day’s walking and scouting tasks</w:t>
             </w:r>
           </w:p>
         </w:tc>

</xml_diff>

<commit_message>
Sales: record any number a day, walk-ins included
- Each sale is its own record: product, quantity and unit (bundles, kg,
  crates, trays, bags), total received, buyer (defaults to Walk-in), paid by
  (cash, EcoCash, bank transfer, on account), date and an optional photo.
  Recorded from Sales or the + sheet, offline like every record.
- The fold projects each sale into sales_usd (and bundles_sold for sales in
  bundles), so the dashboard, KPIs and kale plan count them as before.
- The daily C-02 sales task no longer releases; its earlier records stay
  and are merged into the Sales list, totals and customers.
- Amounts remain owner/task-manager only (stripped for caretakers).

Tests: 98.

Co-Authored-By: Claude Opus 5.5 <noreply@anthropic.com>
Claude-Session: https://claude.ai/code/session_01J6H4iBJTAtuLFm8LTv1m8H
</commit_message>
<xml_diff>
--- a/docs/woodlands-farm-ops-spec-v1.1.docx
+++ b/docs/woodlands-farm-ops-spec-v1.1.docx
@@ -25278,6 +25278,44 @@
             </w:pPr>
             <w:r>
               <w:t xml:space="preserve">6.2</w:t>
+            </w:r>
+          </w:p>
+        </w:tc>
+      </w:tr>
+      <w:tr>
+        <w:tc>
+          <w:tcPr/>
+          <w:p>
+            <w:pPr>
+              <w:pStyle w:val="Compact"/>
+              <w:jc w:val="left"/>
+            </w:pPr>
+            <w:r>
+              <w:t xml:space="preserve">Sales: any number a day (walk-ins included) as sale records (product, quantity and unit, total received, buyer defaulting to Walk-in, payment method, optional photo), projected into sales_usd and bundles_sold readings; the daily C-02 task no longer releases</w:t>
+            </w:r>
+          </w:p>
+        </w:tc>
+        <w:tc>
+          <w:tcPr/>
+          <w:p>
+            <w:pPr>
+              <w:pStyle w:val="Compact"/>
+              <w:jc w:val="left"/>
+            </w:pPr>
+            <w:r>
+              <w:t xml:space="preserve">Built</w:t>
+            </w:r>
+          </w:p>
+        </w:tc>
+        <w:tc>
+          <w:tcPr/>
+          <w:p>
+            <w:pPr>
+              <w:pStyle w:val="Compact"/>
+              <w:jc w:val="left"/>
+            </w:pPr>
+            <w:r>
+              <w:t xml:space="preserve">Sales screen merges earlier C-02 records; amounts for owners and task managers only</w:t>
             </w:r>
           </w:p>
         </w:tc>

</xml_diff>